<commit_message>
feat: agrega gestion de cooperativas
</commit_message>
<xml_diff>
--- a/Requisitos_funcionales_no_funcionales.docx
+++ b/Requisitos_funcionales_no_funcionales.docx
@@ -18802,6 +18802,220 @@
         <w:rPr>
           <w:rtl w:val="0"/>
         </w:rPr>
+      </w:r>
+    </w:p>
+    <w:p>
+      <w:r>
+        <w:br w:type="page"/>
+      </w:r>
+    </w:p>
+    <w:p>
+      <w:pPr>
+        <w:jc w:val="center"/>
+      </w:pPr>
+      <w:r>
+        <w:rPr>
+          <w:b/>
+          <w:sz w:val="52"/>
+        </w:rPr>
+        <w:t>CUMBRE CAFETERA</w:t>
+      </w:r>
+    </w:p>
+    <w:p>
+      <w:pPr>
+        <w:jc w:val="center"/>
+      </w:pPr>
+      <w:r>
+        <w:rPr>
+          <w:b/>
+        </w:rPr>
+        <w:t>ESPECIFICACIÓN DE REQUERIMIENTOS DE SOFTWARE</w:t>
+      </w:r>
+    </w:p>
+    <w:p>
+      <w:pPr>
+        <w:jc w:val="center"/>
+      </w:pPr>
+      <w:r>
+        <w:rPr>
+          <w:b/>
+        </w:rPr>
+        <w:t>No. RF-16</w:t>
+      </w:r>
+    </w:p>
+    <w:p>
+      <w:pPr>
+        <w:jc w:val="center"/>
+      </w:pPr>
+      <w:r>
+        <w:t>SENA - Ficha 3407179</w:t>
+      </w:r>
+    </w:p>
+    <w:tbl>
+      <w:tblPr>
+        <w:tblW w:type="auto" w:w="0"/>
+        <w:tblLook w:firstColumn="1" w:firstRow="1" w:lastColumn="0" w:lastRow="0" w:noHBand="0" w:noVBand="1" w:val="04A0"/>
+      </w:tblPr>
+      <w:tblGrid>
+        <w:gridCol w:w="2340"/>
+        <w:gridCol w:w="2340"/>
+        <w:gridCol w:w="2340"/>
+        <w:gridCol w:w="2340"/>
+      </w:tblGrid>
+      <w:tr>
+        <w:tc>
+          <w:tcPr>
+            <w:tcW w:type="dxa" w:w="2340"/>
+          </w:tcPr>
+          <w:p>
+            <w:r>
+              <w:rPr>
+                <w:b/>
+              </w:rPr>
+              <w:t>ID</w:t>
+            </w:r>
+          </w:p>
+        </w:tc>
+        <w:tc>
+          <w:tcPr>
+            <w:tcW w:type="dxa" w:w="2340"/>
+          </w:tcPr>
+          <w:p>
+            <w:r>
+              <w:rPr>
+                <w:b/>
+              </w:rPr>
+              <w:t>Nombre</w:t>
+            </w:r>
+          </w:p>
+        </w:tc>
+        <w:tc>
+          <w:tcPr>
+            <w:tcW w:type="dxa" w:w="2340"/>
+          </w:tcPr>
+          <w:p>
+            <w:r>
+              <w:rPr>
+                <w:b/>
+              </w:rPr>
+              <w:t>Descripción</w:t>
+            </w:r>
+          </w:p>
+        </w:tc>
+        <w:tc>
+          <w:tcPr>
+            <w:tcW w:type="dxa" w:w="2340"/>
+          </w:tcPr>
+          <w:p>
+            <w:r>
+              <w:rPr>
+                <w:b/>
+              </w:rPr>
+              <w:t>Prioridad</w:t>
+            </w:r>
+          </w:p>
+        </w:tc>
+      </w:tr>
+      <w:tr>
+        <w:tc>
+          <w:tcPr>
+            <w:tcW w:type="dxa" w:w="2340"/>
+          </w:tcPr>
+          <w:p>
+            <w:r>
+              <w:t>RF-16</w:t>
+            </w:r>
+          </w:p>
+        </w:tc>
+        <w:tc>
+          <w:tcPr>
+            <w:tcW w:type="dxa" w:w="2340"/>
+          </w:tcPr>
+          <w:p>
+            <w:r>
+              <w:t>Gestión de cooperativas y ubicación</w:t>
+            </w:r>
+          </w:p>
+        </w:tc>
+        <w:tc>
+          <w:tcPr>
+            <w:tcW w:type="dxa" w:w="2340"/>
+          </w:tcPr>
+          <w:p>
+            <w:r>
+              <w:t>El sistema debe permitir al Registrador crear, consultar, editar y eliminar cooperativas, registrando nombre, teléfono, correo, departamento, municipio, dirección y coordenadas geográficas.</w:t>
+            </w:r>
+          </w:p>
+        </w:tc>
+        <w:tc>
+          <w:tcPr>
+            <w:tcW w:type="dxa" w:w="2340"/>
+          </w:tcPr>
+          <w:p>
+            <w:r>
+              <w:t>Alta</w:t>
+            </w:r>
+          </w:p>
+        </w:tc>
+      </w:tr>
+    </w:tbl>
+    <w:p/>
+    <w:p>
+      <w:r>
+        <w:rPr>
+          <w:b/>
+        </w:rPr>
+        <w:t>Controles y restricciones.</w:t>
+      </w:r>
+    </w:p>
+    <w:p>
+      <w:r>
+        <w:t>Solo el Registrador puede crear, editar y eliminar cooperativas. El teléfono debe contener exactamente 10 dígitos, el correo debe ser válido y no se permiten nombres ni correos duplicados. La ubicación debe incluir dirección, departamento, municipio, latitud y longitud válidas. Una cooperativa con rutas o cargas asociadas no puede eliminarse.</w:t>
+      </w:r>
+    </w:p>
+    <w:p/>
+    <w:p>
+      <w:r>
+        <w:rPr>
+          <w:b/>
+        </w:rPr>
+        <w:t>Criterios de aceptación.</w:t>
+      </w:r>
+    </w:p>
+    <w:p>
+      <w:r>
+        <w:t>La cooperativa y su ubicación se almacenan en una única operación y aparecen en el listado del Registrador. El sistema permite actualizar sus datos, capturar coordenadas mediante GPS y rechaza registros incompletos o duplicados.</w:t>
+      </w:r>
+    </w:p>
+    <w:p/>
+    <w:p>
+      <w:r>
+        <w:t>Fecha de especificación</w:t>
+      </w:r>
+    </w:p>
+    <w:p>
+      <w:r>
+        <w:t>02/09/2026</w:t>
+      </w:r>
+    </w:p>
+    <w:p>
+      <w:r>
+        <w:t>Firma (Dueño del proceso): BRANDON CRISTOPHER POVEDA ROMERO</w:t>
+      </w:r>
+    </w:p>
+    <w:p>
+      <w:r>
+        <w:t>Firma(s) Usuarios participantes: CRISTIAN RONALDO HERNANDEZ DUCUARA</w:t>
+      </w:r>
+    </w:p>
+    <w:p>
+      <w:r>
+        <w:t>Firma(s) Demás usuarios: JHONATAN DAVID PRIETO GONZALEZ, NICOLAS RAMIREZ RINCÓN</w:t>
+      </w:r>
+    </w:p>
+    <w:p>
+      <w:r>
+        <w:br w:type="page"/>
       </w:r>
     </w:p>
     <w:p>

</xml_diff>